<commit_message>
Practical1 to practical 13
</commit_message>
<xml_diff>
--- a/prac4.docx
+++ b/prac4.docx
@@ -1,6 +1,6 @@
 
 <file path=word/document.xml><?xml version="1.0" encoding="utf-8"?>
-<w:document xmlns:wpc="http://schemas.microsoft.com/office/word/2010/wordprocessingCanvas" xmlns:cx="http://schemas.microsoft.com/office/drawing/2014/chartex" xmlns:cx1="http://schemas.microsoft.com/office/drawing/2015/9/8/chartex" xmlns:cx2="http://schemas.microsoft.com/office/drawing/2015/10/21/chartex" xmlns:cx3="http://schemas.microsoft.com/office/drawing/2016/5/9/chartex" xmlns:cx4="http://schemas.microsoft.com/office/drawing/2016/5/10/chartex" xmlns:cx5="http://schemas.microsoft.com/office/drawing/2016/5/11/chartex" xmlns:cx6="http://schemas.microsoft.com/office/drawing/2016/5/12/chartex" xmlns:cx7="http://schemas.microsoft.com/office/drawing/2016/5/13/chartex" xmlns:cx8="http://schemas.microsoft.com/office/drawing/2016/5/14/chartex" xmlns:mc="http://schemas.openxmlformats.org/markup-compatibility/2006" xmlns:aink="http://schemas.microsoft.com/office/drawing/2016/ink" xmlns:am3d="http://schemas.microsoft.com/office/drawing/2017/model3d" xmlns:o="urn:schemas-microsoft-com:office:office" xmlns:oel="http://schemas.microsoft.com/office/2019/extlst" xmlns:r="http://schemas.openxmlformats.org/officeDocument/2006/relationships" xmlns:m="http://schemas.openxmlformats.org/officeDocument/2006/math" xmlns:v="urn:schemas-microsoft-com:vml" xmlns:wp14="http://schemas.microsoft.com/office/word/2010/wordprocessingDrawing" xmlns:wp="http://schemas.openxmlformats.org/drawingml/2006/wordprocessingDrawing" xmlns:w10="urn:schemas-microsoft-com:office:word" xmlns:w="http://schemas.openxmlformats.org/wordprocessingml/2006/main" xmlns:w14="http://schemas.microsoft.com/office/word/2010/wordml" xmlns:w15="http://schemas.microsoft.com/office/word/2012/wordml" xmlns:w16cei="http://schemas.microsoft.com/office/word/2026/wordml/cei" xmlns:w16cex="http://schemas.microsoft.com/office/word/2018/wordml/cex" xmlns:w16cid="http://schemas.microsoft.com/office/word/2016/wordml/cid" xmlns:w16="http://schemas.microsoft.com/office/word/2018/wordml" xmlns:w16du="http://schemas.microsoft.com/office/word/2023/wordml/word16du" xmlns:w16sdtdh="http://schemas.microsoft.com/office/word/2020/wordml/sdtdatahash" xmlns:w16sdtfl="http://schemas.microsoft.com/office/word/2024/wordml/sdtformatlock" xmlns:w16se="http://schemas.microsoft.com/office/word/2015/wordml/symex" xmlns:wpg="http://schemas.microsoft.com/office/word/2010/wordprocessingGroup" xmlns:wpi="http://schemas.microsoft.com/office/word/2010/wordprocessingInk" xmlns:wne="http://schemas.microsoft.com/office/word/2006/wordml" xmlns:wps="http://schemas.microsoft.com/office/word/2010/wordprocessingShape" mc:Ignorable="w14 w15 w16se w16cid w16 w16cex w16sdtdh w16sdtfl w16du wp14">
+<w:document xmlns:wpc="http://schemas.microsoft.com/office/word/2010/wordprocessingCanvas" xmlns:cx="http://schemas.microsoft.com/office/drawing/2014/chartex" xmlns:cx1="http://schemas.microsoft.com/office/drawing/2015/9/8/chartex" xmlns:cx2="http://schemas.microsoft.com/office/drawing/2015/10/21/chartex" xmlns:cx3="http://schemas.microsoft.com/office/drawing/2016/5/9/chartex" xmlns:cx4="http://schemas.microsoft.com/office/drawing/2016/5/10/chartex" xmlns:cx5="http://schemas.microsoft.com/office/drawing/2016/5/11/chartex" xmlns:cx6="http://schemas.microsoft.com/office/drawing/2016/5/12/chartex" xmlns:cx7="http://schemas.microsoft.com/office/drawing/2016/5/13/chartex" xmlns:cx8="http://schemas.microsoft.com/office/drawing/2016/5/14/chartex" xmlns:mc="http://schemas.openxmlformats.org/markup-compatibility/2006" xmlns:aink="http://schemas.microsoft.com/office/drawing/2016/ink" xmlns:am3d="http://schemas.microsoft.com/office/drawing/2017/model3d" xmlns:o="urn:schemas-microsoft-com:office:office" xmlns:oel="http://schemas.microsoft.com/office/2019/extlst" xmlns:r="http://schemas.openxmlformats.org/officeDocument/2006/relationships" xmlns:m="http://schemas.openxmlformats.org/officeDocument/2006/math" xmlns:v="urn:schemas-microsoft-com:vml" xmlns:wp14="http://schemas.microsoft.com/office/word/2010/wordprocessingDrawing" xmlns:wp="http://schemas.openxmlformats.org/drawingml/2006/wordprocessingDrawing" xmlns:w10="urn:schemas-microsoft-com:office:word" xmlns:w="http://schemas.openxmlformats.org/wordprocessingml/2006/main" xmlns:w14="http://schemas.microsoft.com/office/word/2010/wordml" xmlns:w15="http://schemas.microsoft.com/office/word/2012/wordml" xmlns:w16cex="http://schemas.microsoft.com/office/word/2018/wordml/cex" xmlns:w16cid="http://schemas.microsoft.com/office/word/2016/wordml/cid" xmlns:w16="http://schemas.microsoft.com/office/word/2018/wordml" xmlns:w16du="http://schemas.microsoft.com/office/word/2023/wordml/word16du" xmlns:w16sdtdh="http://schemas.microsoft.com/office/word/2020/wordml/sdtdatahash" xmlns:w16sdtfl="http://schemas.microsoft.com/office/word/2024/wordml/sdtformatlock" xmlns:w16se="http://schemas.microsoft.com/office/word/2015/wordml/symex" xmlns:wpg="http://schemas.microsoft.com/office/word/2010/wordprocessingGroup" xmlns:wpi="http://schemas.microsoft.com/office/word/2010/wordprocessingInk" xmlns:wne="http://schemas.microsoft.com/office/word/2006/wordml" xmlns:wps="http://schemas.microsoft.com/office/word/2010/wordprocessingShape" mc:Ignorable="w14 w15 w16se w16cid w16 w16cex w16sdtdh w16sdtfl w16du wp14">
   <w:body>
     <w:p>
       <w:pPr>
@@ -14,7 +14,7 @@
           <w:noProof/>
         </w:rPr>
         <w:drawing>
-          <wp:inline distT="0" distB="0" distL="0" distR="0" wp14:anchorId="66A00A26" wp14:editId="5573B6F9">
+          <wp:inline distT="0" distB="0" distL="0" distR="0" wp14:anchorId="66A00A26" wp14:editId="3DE6FF21">
             <wp:extent cx="5731510" cy="1042751"/>
             <wp:effectExtent l="0" t="0" r="2540" b="5080"/>
             <wp:docPr id="1579756081" name="Picture 1" descr="CHARUSAT - Admission"/>
@@ -1515,29 +1515,7 @@
           <w:szCs w:val="44"/>
           <w:u w:val="single"/>
         </w:rPr>
-        <w:t>Template filler (TemplateFiller.java +</w:t>
-      </w:r>
-      <w:r>
-        <w:rPr>
-          <w:rFonts w:ascii="Times New Roman" w:hAnsi="Times New Roman" w:cs="Times New Roman"/>
-          <w:b/>
-          <w:bCs/>
-          <w:sz w:val="32"/>
-          <w:szCs w:val="44"/>
-          <w:u w:val="single"/>
-        </w:rPr>
-        <w:t xml:space="preserve"> </w:t>
-      </w:r>
-      <w:r>
-        <w:rPr>
-          <w:rFonts w:ascii="Times New Roman" w:hAnsi="Times New Roman" w:cs="Times New Roman"/>
-          <w:b/>
-          <w:bCs/>
-          <w:sz w:val="32"/>
-          <w:szCs w:val="44"/>
-          <w:u w:val="single"/>
-        </w:rPr>
-        <w:t>Driver.java)</w:t>
+        <w:t>Template filler (TemplateFiller.java + Driver.java)</w:t>
       </w:r>
     </w:p>
     <w:p>
@@ -1772,7 +1750,7 @@
           <w:szCs w:val="44"/>
         </w:rPr>
         <w:drawing>
-          <wp:inline distT="0" distB="0" distL="0" distR="0" wp14:anchorId="72F2C32A" wp14:editId="7D317899">
+          <wp:inline distT="0" distB="0" distL="0" distR="0" wp14:anchorId="72F2C32A" wp14:editId="370E6289">
             <wp:extent cx="3278770" cy="2777836"/>
             <wp:effectExtent l="0" t="0" r="0" b="3810"/>
             <wp:docPr id="42512700" name="Picture 9"/>
@@ -2005,29 +1983,349 @@
       <w:pPr>
         <w:rPr>
           <w:rFonts w:ascii="Times New Roman" w:hAnsi="Times New Roman" w:cs="Times New Roman"/>
-        </w:rPr>
-      </w:pPr>
-    </w:p>
-    <w:p>
-      <w:pPr>
-        <w:rPr>
-          <w:rFonts w:ascii="Times New Roman" w:hAnsi="Times New Roman" w:cs="Times New Roman"/>
-        </w:rPr>
-      </w:pPr>
-    </w:p>
-    <w:p>
-      <w:pPr>
-        <w:rPr>
-          <w:rFonts w:ascii="Times New Roman" w:hAnsi="Times New Roman" w:cs="Times New Roman"/>
-        </w:rPr>
-      </w:pPr>
-    </w:p>
-    <w:p>
-      <w:pPr>
-        <w:rPr>
-          <w:rFonts w:ascii="Times New Roman" w:hAnsi="Times New Roman" w:cs="Times New Roman"/>
-        </w:rPr>
-      </w:pPr>
+          <w:b/>
+          <w:bCs/>
+          <w:sz w:val="36"/>
+          <w:szCs w:val="44"/>
+        </w:rPr>
+      </w:pPr>
+    </w:p>
+    <w:p>
+      <w:pPr>
+        <w:rPr>
+          <w:rFonts w:ascii="Times New Roman" w:hAnsi="Times New Roman" w:cs="Times New Roman"/>
+          <w:b/>
+          <w:bCs/>
+          <w:sz w:val="28"/>
+          <w:szCs w:val="44"/>
+          <w:u w:val="single"/>
+        </w:rPr>
+      </w:pPr>
+      <w:r>
+        <w:rPr>
+          <w:rFonts w:ascii="Times New Roman" w:hAnsi="Times New Roman" w:cs="Times New Roman"/>
+          <w:b/>
+          <w:bCs/>
+          <w:sz w:val="28"/>
+          <w:szCs w:val="44"/>
+          <w:u w:val="single"/>
+        </w:rPr>
+        <w:t>Key Questions:</w:t>
+      </w:r>
+    </w:p>
+    <w:p>
+      <w:pPr>
+        <w:pStyle w:val="ListParagraph"/>
+        <w:numPr>
+          <w:ilvl w:val="0"/>
+          <w:numId w:val="2"/>
+        </w:numPr>
+        <w:rPr>
+          <w:rFonts w:ascii="Times New Roman" w:hAnsi="Times New Roman" w:cs="Times New Roman"/>
+          <w:b/>
+          <w:bCs/>
+          <w:sz w:val="28"/>
+        </w:rPr>
+      </w:pPr>
+      <w:r>
+        <w:rPr>
+          <w:rFonts w:ascii="Times New Roman" w:hAnsi="Times New Roman" w:cs="Times New Roman"/>
+          <w:b/>
+          <w:bCs/>
+          <w:sz w:val="28"/>
+        </w:rPr>
+        <w:t xml:space="preserve">What is the difference between String, StringBuilder and </w:t>
+      </w:r>
+      <w:proofErr w:type="spellStart"/>
+      <w:r>
+        <w:rPr>
+          <w:rFonts w:ascii="Times New Roman" w:hAnsi="Times New Roman" w:cs="Times New Roman"/>
+          <w:b/>
+          <w:bCs/>
+          <w:sz w:val="28"/>
+        </w:rPr>
+        <w:t>StringBuffer</w:t>
+      </w:r>
+      <w:proofErr w:type="spellEnd"/>
+      <w:r>
+        <w:rPr>
+          <w:rFonts w:ascii="Times New Roman" w:hAnsi="Times New Roman" w:cs="Times New Roman"/>
+          <w:b/>
+          <w:bCs/>
+          <w:sz w:val="28"/>
+        </w:rPr>
+        <w:t>, and when is each</w:t>
+      </w:r>
+      <w:r>
+        <w:rPr>
+          <w:rFonts w:ascii="Times New Roman" w:hAnsi="Times New Roman" w:cs="Times New Roman"/>
+          <w:b/>
+          <w:bCs/>
+          <w:sz w:val="28"/>
+        </w:rPr>
+        <w:t xml:space="preserve"> </w:t>
+      </w:r>
+      <w:r>
+        <w:rPr>
+          <w:rFonts w:ascii="Times New Roman" w:hAnsi="Times New Roman" w:cs="Times New Roman"/>
+          <w:b/>
+          <w:bCs/>
+          <w:sz w:val="28"/>
+        </w:rPr>
+        <w:t>preferred?</w:t>
+      </w:r>
+    </w:p>
+    <w:p>
+      <w:pPr>
+        <w:pStyle w:val="ListParagraph"/>
+        <w:rPr>
+          <w:rFonts w:ascii="Times New Roman" w:hAnsi="Times New Roman" w:cs="Times New Roman"/>
+        </w:rPr>
+      </w:pPr>
+      <w:r>
+        <w:rPr>
+          <w:rFonts w:ascii="Times New Roman" w:hAnsi="Times New Roman" w:cs="Times New Roman"/>
+          <w:b/>
+          <w:bCs/>
+        </w:rPr>
+        <w:t>String:</w:t>
+      </w:r>
+      <w:r>
+        <w:rPr>
+          <w:rFonts w:ascii="Times New Roman" w:hAnsi="Times New Roman" w:cs="Times New Roman"/>
+        </w:rPr>
+        <w:t xml:space="preserve"> Immutable; use for fixed text.</w:t>
+      </w:r>
+      <w:r>
+        <w:rPr>
+          <w:rFonts w:ascii="Times New Roman" w:hAnsi="Times New Roman" w:cs="Times New Roman"/>
+        </w:rPr>
+        <w:br/>
+      </w:r>
+      <w:r>
+        <w:rPr>
+          <w:rFonts w:ascii="Times New Roman" w:hAnsi="Times New Roman" w:cs="Times New Roman"/>
+          <w:b/>
+          <w:bCs/>
+        </w:rPr>
+        <w:t>StringBuilder:</w:t>
+      </w:r>
+      <w:r>
+        <w:rPr>
+          <w:rFonts w:ascii="Times New Roman" w:hAnsi="Times New Roman" w:cs="Times New Roman"/>
+        </w:rPr>
+        <w:t xml:space="preserve"> Mutable and faster; use for frequent modifications in single-threaded code.</w:t>
+      </w:r>
+      <w:r>
+        <w:rPr>
+          <w:rFonts w:ascii="Times New Roman" w:hAnsi="Times New Roman" w:cs="Times New Roman"/>
+        </w:rPr>
+        <w:br/>
+      </w:r>
+      <w:proofErr w:type="spellStart"/>
+      <w:r>
+        <w:rPr>
+          <w:rFonts w:ascii="Times New Roman" w:hAnsi="Times New Roman" w:cs="Times New Roman"/>
+          <w:b/>
+          <w:bCs/>
+        </w:rPr>
+        <w:t>StringBuffer</w:t>
+      </w:r>
+      <w:proofErr w:type="spellEnd"/>
+      <w:r>
+        <w:rPr>
+          <w:rFonts w:ascii="Times New Roman" w:hAnsi="Times New Roman" w:cs="Times New Roman"/>
+          <w:b/>
+          <w:bCs/>
+        </w:rPr>
+        <w:t>:</w:t>
+      </w:r>
+      <w:r>
+        <w:rPr>
+          <w:rFonts w:ascii="Times New Roman" w:hAnsi="Times New Roman" w:cs="Times New Roman"/>
+        </w:rPr>
+        <w:t xml:space="preserve"> Mutable and synchronized; use when thread safety is required.</w:t>
+      </w:r>
+    </w:p>
+    <w:p>
+      <w:pPr>
+        <w:pStyle w:val="ListParagraph"/>
+        <w:rPr>
+          <w:rFonts w:ascii="Times New Roman" w:hAnsi="Times New Roman" w:cs="Times New Roman"/>
+        </w:rPr>
+      </w:pPr>
+    </w:p>
+    <w:p>
+      <w:pPr>
+        <w:pStyle w:val="ListParagraph"/>
+        <w:numPr>
+          <w:ilvl w:val="0"/>
+          <w:numId w:val="2"/>
+        </w:numPr>
+        <w:rPr>
+          <w:rFonts w:ascii="Times New Roman" w:hAnsi="Times New Roman" w:cs="Times New Roman"/>
+          <w:b/>
+          <w:bCs/>
+          <w:sz w:val="28"/>
+        </w:rPr>
+      </w:pPr>
+      <w:r>
+        <w:rPr>
+          <w:rFonts w:ascii="Times New Roman" w:hAnsi="Times New Roman" w:cs="Times New Roman"/>
+          <w:b/>
+          <w:bCs/>
+          <w:sz w:val="28"/>
+        </w:rPr>
+        <w:t>What does the regular expression [6-</w:t>
+      </w:r>
+      <w:proofErr w:type="gramStart"/>
+      <w:r>
+        <w:rPr>
+          <w:rFonts w:ascii="Times New Roman" w:hAnsi="Times New Roman" w:cs="Times New Roman"/>
+          <w:b/>
+          <w:bCs/>
+          <w:sz w:val="28"/>
+        </w:rPr>
+        <w:t>9][</w:t>
+      </w:r>
+      <w:proofErr w:type="gramEnd"/>
+      <w:r>
+        <w:rPr>
+          <w:rFonts w:ascii="Times New Roman" w:hAnsi="Times New Roman" w:cs="Times New Roman"/>
+          <w:b/>
+          <w:bCs/>
+          <w:sz w:val="28"/>
+        </w:rPr>
+        <w:t>0-9]{9} match, and why use anchors?</w:t>
+      </w:r>
+    </w:p>
+    <w:p>
+      <w:pPr>
+        <w:pStyle w:val="ListParagraph"/>
+        <w:rPr>
+          <w:rFonts w:ascii="Times New Roman" w:hAnsi="Times New Roman" w:cs="Times New Roman"/>
+        </w:rPr>
+      </w:pPr>
+      <w:r>
+        <w:rPr>
+          <w:rFonts w:ascii="Times New Roman" w:hAnsi="Times New Roman" w:cs="Times New Roman"/>
+          <w:b/>
+          <w:bCs/>
+        </w:rPr>
+        <w:t>[6-</w:t>
+      </w:r>
+      <w:proofErr w:type="gramStart"/>
+      <w:r>
+        <w:rPr>
+          <w:rFonts w:ascii="Times New Roman" w:hAnsi="Times New Roman" w:cs="Times New Roman"/>
+          <w:b/>
+          <w:bCs/>
+        </w:rPr>
+        <w:t>9][</w:t>
+      </w:r>
+      <w:proofErr w:type="gramEnd"/>
+      <w:r>
+        <w:rPr>
+          <w:rFonts w:ascii="Times New Roman" w:hAnsi="Times New Roman" w:cs="Times New Roman"/>
+          <w:b/>
+          <w:bCs/>
+        </w:rPr>
+        <w:t>0-9]{9}</w:t>
+      </w:r>
+      <w:r>
+        <w:rPr>
+          <w:rFonts w:ascii="Times New Roman" w:hAnsi="Times New Roman" w:cs="Times New Roman"/>
+        </w:rPr>
+        <w:t xml:space="preserve"> matches a </w:t>
+      </w:r>
+      <w:r>
+        <w:rPr>
+          <w:rFonts w:ascii="Times New Roman" w:hAnsi="Times New Roman" w:cs="Times New Roman"/>
+          <w:b/>
+          <w:bCs/>
+        </w:rPr>
+        <w:t>10-digit number starting with 6–9</w:t>
+      </w:r>
+      <w:r>
+        <w:rPr>
+          <w:rFonts w:ascii="Times New Roman" w:hAnsi="Times New Roman" w:cs="Times New Roman"/>
+        </w:rPr>
+        <w:t xml:space="preserve">. Anchors (^ and $) ensure the </w:t>
+      </w:r>
+      <w:r>
+        <w:rPr>
+          <w:rFonts w:ascii="Times New Roman" w:hAnsi="Times New Roman" w:cs="Times New Roman"/>
+          <w:b/>
+          <w:bCs/>
+        </w:rPr>
+        <w:t>entire input</w:t>
+      </w:r>
+      <w:r>
+        <w:rPr>
+          <w:rFonts w:ascii="Times New Roman" w:hAnsi="Times New Roman" w:cs="Times New Roman"/>
+        </w:rPr>
+        <w:t xml:space="preserve"> matches the pattern.</w:t>
+      </w:r>
+    </w:p>
+    <w:p>
+      <w:pPr>
+        <w:pStyle w:val="ListParagraph"/>
+        <w:rPr>
+          <w:rFonts w:ascii="Times New Roman" w:hAnsi="Times New Roman" w:cs="Times New Roman"/>
+        </w:rPr>
+      </w:pPr>
+    </w:p>
+    <w:p>
+      <w:pPr>
+        <w:pStyle w:val="ListParagraph"/>
+        <w:numPr>
+          <w:ilvl w:val="0"/>
+          <w:numId w:val="2"/>
+        </w:numPr>
+        <w:rPr>
+          <w:rFonts w:ascii="Times New Roman" w:hAnsi="Times New Roman" w:cs="Times New Roman"/>
+          <w:b/>
+          <w:bCs/>
+          <w:sz w:val="28"/>
+        </w:rPr>
+      </w:pPr>
+      <w:r>
+        <w:rPr>
+          <w:rFonts w:ascii="Times New Roman" w:hAnsi="Times New Roman" w:cs="Times New Roman"/>
+          <w:b/>
+          <w:bCs/>
+          <w:sz w:val="28"/>
+        </w:rPr>
+        <w:t>Why should input be validated at the boundary before it is used?</w:t>
+      </w:r>
+    </w:p>
+    <w:p>
+      <w:pPr>
+        <w:pStyle w:val="ListParagraph"/>
+        <w:rPr>
+          <w:rFonts w:ascii="Times New Roman" w:hAnsi="Times New Roman" w:cs="Times New Roman"/>
+        </w:rPr>
+      </w:pPr>
+      <w:r>
+        <w:rPr>
+          <w:rFonts w:ascii="Times New Roman" w:hAnsi="Times New Roman" w:cs="Times New Roman"/>
+        </w:rPr>
+        <w:t xml:space="preserve">Input should be validated at the </w:t>
+      </w:r>
+      <w:r>
+        <w:rPr>
+          <w:rFonts w:ascii="Times New Roman" w:hAnsi="Times New Roman" w:cs="Times New Roman"/>
+          <w:b/>
+          <w:bCs/>
+        </w:rPr>
+        <w:t>boundary</w:t>
+      </w:r>
+      <w:r>
+        <w:rPr>
+          <w:rFonts w:ascii="Times New Roman" w:hAnsi="Times New Roman" w:cs="Times New Roman"/>
+        </w:rPr>
+        <w:t xml:space="preserve"> to reject invalid or unsafe data early, before it enters the system and causes errors or security issues.</w:t>
+      </w:r>
     </w:p>
     <w:sectPr>
       <w:headerReference w:type="default" r:id="rId17"/>
@@ -2048,7 +2346,7 @@
 </file>
 
 <file path=word/endnotes.xml><?xml version="1.0" encoding="utf-8"?>
-<w:endnotes xmlns:wpc="http://schemas.microsoft.com/office/word/2010/wordprocessingCanvas" xmlns:cx="http://schemas.microsoft.com/office/drawing/2014/chartex" xmlns:cx1="http://schemas.microsoft.com/office/drawing/2015/9/8/chartex" xmlns:cx2="http://schemas.microsoft.com/office/drawing/2015/10/21/chartex" xmlns:cx3="http://schemas.microsoft.com/office/drawing/2016/5/9/chartex" xmlns:cx4="http://schemas.microsoft.com/office/drawing/2016/5/10/chartex" xmlns:cx5="http://schemas.microsoft.com/office/drawing/2016/5/11/chartex" xmlns:cx6="http://schemas.microsoft.com/office/drawing/2016/5/12/chartex" xmlns:cx7="http://schemas.microsoft.com/office/drawing/2016/5/13/chartex" xmlns:cx8="http://schemas.microsoft.com/office/drawing/2016/5/14/chartex" xmlns:mc="http://schemas.openxmlformats.org/markup-compatibility/2006" xmlns:aink="http://schemas.microsoft.com/office/drawing/2016/ink" xmlns:am3d="http://schemas.microsoft.com/office/drawing/2017/model3d" xmlns:o="urn:schemas-microsoft-com:office:office" xmlns:oel="http://schemas.microsoft.com/office/2019/extlst" xmlns:r="http://schemas.openxmlformats.org/officeDocument/2006/relationships" xmlns:m="http://schemas.openxmlformats.org/officeDocument/2006/math" xmlns:v="urn:schemas-microsoft-com:vml" xmlns:wp14="http://schemas.microsoft.com/office/word/2010/wordprocessingDrawing" xmlns:wp="http://schemas.openxmlformats.org/drawingml/2006/wordprocessingDrawing" xmlns:w10="urn:schemas-microsoft-com:office:word" xmlns:w="http://schemas.openxmlformats.org/wordprocessingml/2006/main" xmlns:w14="http://schemas.microsoft.com/office/word/2010/wordml" xmlns:w15="http://schemas.microsoft.com/office/word/2012/wordml" xmlns:w16cei="http://schemas.microsoft.com/office/word/2026/wordml/cei" xmlns:w16cex="http://schemas.microsoft.com/office/word/2018/wordml/cex" xmlns:w16cid="http://schemas.microsoft.com/office/word/2016/wordml/cid" xmlns:w16="http://schemas.microsoft.com/office/word/2018/wordml" xmlns:w16du="http://schemas.microsoft.com/office/word/2023/wordml/word16du" xmlns:w16sdtdh="http://schemas.microsoft.com/office/word/2020/wordml/sdtdatahash" xmlns:w16sdtfl="http://schemas.microsoft.com/office/word/2024/wordml/sdtformatlock" xmlns:w16se="http://schemas.microsoft.com/office/word/2015/wordml/symex" xmlns:wpg="http://schemas.microsoft.com/office/word/2010/wordprocessingGroup" xmlns:wpi="http://schemas.microsoft.com/office/word/2010/wordprocessingInk" xmlns:wne="http://schemas.microsoft.com/office/word/2006/wordml" xmlns:wps="http://schemas.microsoft.com/office/word/2010/wordprocessingShape" mc:Ignorable="w14 w15 w16se w16cid w16 w16cex w16sdtdh w16sdtfl w16du wp14">
+<w:endnotes xmlns:wpc="http://schemas.microsoft.com/office/word/2010/wordprocessingCanvas" xmlns:cx="http://schemas.microsoft.com/office/drawing/2014/chartex" xmlns:cx1="http://schemas.microsoft.com/office/drawing/2015/9/8/chartex" xmlns:cx2="http://schemas.microsoft.com/office/drawing/2015/10/21/chartex" xmlns:cx3="http://schemas.microsoft.com/office/drawing/2016/5/9/chartex" xmlns:cx4="http://schemas.microsoft.com/office/drawing/2016/5/10/chartex" xmlns:cx5="http://schemas.microsoft.com/office/drawing/2016/5/11/chartex" xmlns:cx6="http://schemas.microsoft.com/office/drawing/2016/5/12/chartex" xmlns:cx7="http://schemas.microsoft.com/office/drawing/2016/5/13/chartex" xmlns:cx8="http://schemas.microsoft.com/office/drawing/2016/5/14/chartex" xmlns:mc="http://schemas.openxmlformats.org/markup-compatibility/2006" xmlns:aink="http://schemas.microsoft.com/office/drawing/2016/ink" xmlns:am3d="http://schemas.microsoft.com/office/drawing/2017/model3d" xmlns:o="urn:schemas-microsoft-com:office:office" xmlns:oel="http://schemas.microsoft.com/office/2019/extlst" xmlns:r="http://schemas.openxmlformats.org/officeDocument/2006/relationships" xmlns:m="http://schemas.openxmlformats.org/officeDocument/2006/math" xmlns:v="urn:schemas-microsoft-com:vml" xmlns:wp14="http://schemas.microsoft.com/office/word/2010/wordprocessingDrawing" xmlns:wp="http://schemas.openxmlformats.org/drawingml/2006/wordprocessingDrawing" xmlns:w10="urn:schemas-microsoft-com:office:word" xmlns:w="http://schemas.openxmlformats.org/wordprocessingml/2006/main" xmlns:w14="http://schemas.microsoft.com/office/word/2010/wordml" xmlns:w15="http://schemas.microsoft.com/office/word/2012/wordml" xmlns:w16cex="http://schemas.microsoft.com/office/word/2018/wordml/cex" xmlns:w16cid="http://schemas.microsoft.com/office/word/2016/wordml/cid" xmlns:w16="http://schemas.microsoft.com/office/word/2018/wordml" xmlns:w16du="http://schemas.microsoft.com/office/word/2023/wordml/word16du" xmlns:w16sdtdh="http://schemas.microsoft.com/office/word/2020/wordml/sdtdatahash" xmlns:w16sdtfl="http://schemas.microsoft.com/office/word/2024/wordml/sdtformatlock" xmlns:w16se="http://schemas.microsoft.com/office/word/2015/wordml/symex" xmlns:wpg="http://schemas.microsoft.com/office/word/2010/wordprocessingGroup" xmlns:wpi="http://schemas.microsoft.com/office/word/2010/wordprocessingInk" xmlns:wne="http://schemas.microsoft.com/office/word/2006/wordml" xmlns:wps="http://schemas.microsoft.com/office/word/2010/wordprocessingShape" mc:Ignorable="w14 w15 w16se w16cid w16 w16cex w16sdtdh w16sdtfl w16du wp14">
   <w:endnote w:type="separator" w:id="-1">
     <w:p>
       <w:pPr>
@@ -2073,7 +2371,7 @@
 </file>
 
 <file path=word/footer1.xml><?xml version="1.0" encoding="utf-8"?>
-<w:ftr xmlns:wpc="http://schemas.microsoft.com/office/word/2010/wordprocessingCanvas" xmlns:cx="http://schemas.microsoft.com/office/drawing/2014/chartex" xmlns:cx1="http://schemas.microsoft.com/office/drawing/2015/9/8/chartex" xmlns:cx2="http://schemas.microsoft.com/office/drawing/2015/10/21/chartex" xmlns:cx3="http://schemas.microsoft.com/office/drawing/2016/5/9/chartex" xmlns:cx4="http://schemas.microsoft.com/office/drawing/2016/5/10/chartex" xmlns:cx5="http://schemas.microsoft.com/office/drawing/2016/5/11/chartex" xmlns:cx6="http://schemas.microsoft.com/office/drawing/2016/5/12/chartex" xmlns:cx7="http://schemas.microsoft.com/office/drawing/2016/5/13/chartex" xmlns:cx8="http://schemas.microsoft.com/office/drawing/2016/5/14/chartex" xmlns:mc="http://schemas.openxmlformats.org/markup-compatibility/2006" xmlns:aink="http://schemas.microsoft.com/office/drawing/2016/ink" xmlns:am3d="http://schemas.microsoft.com/office/drawing/2017/model3d" xmlns:o="urn:schemas-microsoft-com:office:office" xmlns:oel="http://schemas.microsoft.com/office/2019/extlst" xmlns:r="http://schemas.openxmlformats.org/officeDocument/2006/relationships" xmlns:m="http://schemas.openxmlformats.org/officeDocument/2006/math" xmlns:v="urn:schemas-microsoft-com:vml" xmlns:wp14="http://schemas.microsoft.com/office/word/2010/wordprocessingDrawing" xmlns:wp="http://schemas.openxmlformats.org/drawingml/2006/wordprocessingDrawing" xmlns:w10="urn:schemas-microsoft-com:office:word" xmlns:w="http://schemas.openxmlformats.org/wordprocessingml/2006/main" xmlns:w14="http://schemas.microsoft.com/office/word/2010/wordml" xmlns:w15="http://schemas.microsoft.com/office/word/2012/wordml" xmlns:w16cei="http://schemas.microsoft.com/office/word/2026/wordml/cei" xmlns:w16cex="http://schemas.microsoft.com/office/word/2018/wordml/cex" xmlns:w16cid="http://schemas.microsoft.com/office/word/2016/wordml/cid" xmlns:w16="http://schemas.microsoft.com/office/word/2018/wordml" xmlns:w16du="http://schemas.microsoft.com/office/word/2023/wordml/word16du" xmlns:w16sdtdh="http://schemas.microsoft.com/office/word/2020/wordml/sdtdatahash" xmlns:w16sdtfl="http://schemas.microsoft.com/office/word/2024/wordml/sdtformatlock" xmlns:w16se="http://schemas.microsoft.com/office/word/2015/wordml/symex" xmlns:wpg="http://schemas.microsoft.com/office/word/2010/wordprocessingGroup" xmlns:wpi="http://schemas.microsoft.com/office/word/2010/wordprocessingInk" xmlns:wne="http://schemas.microsoft.com/office/word/2006/wordml" xmlns:wps="http://schemas.microsoft.com/office/word/2010/wordprocessingShape" mc:Ignorable="w14 w15 w16se w16cid w16 w16cex w16sdtdh w16sdtfl w16du wp14">
+<w:ftr xmlns:wpc="http://schemas.microsoft.com/office/word/2010/wordprocessingCanvas" xmlns:cx="http://schemas.microsoft.com/office/drawing/2014/chartex" xmlns:cx1="http://schemas.microsoft.com/office/drawing/2015/9/8/chartex" xmlns:cx2="http://schemas.microsoft.com/office/drawing/2015/10/21/chartex" xmlns:cx3="http://schemas.microsoft.com/office/drawing/2016/5/9/chartex" xmlns:cx4="http://schemas.microsoft.com/office/drawing/2016/5/10/chartex" xmlns:cx5="http://schemas.microsoft.com/office/drawing/2016/5/11/chartex" xmlns:cx6="http://schemas.microsoft.com/office/drawing/2016/5/12/chartex" xmlns:cx7="http://schemas.microsoft.com/office/drawing/2016/5/13/chartex" xmlns:cx8="http://schemas.microsoft.com/office/drawing/2016/5/14/chartex" xmlns:mc="http://schemas.openxmlformats.org/markup-compatibility/2006" xmlns:aink="http://schemas.microsoft.com/office/drawing/2016/ink" xmlns:am3d="http://schemas.microsoft.com/office/drawing/2017/model3d" xmlns:o="urn:schemas-microsoft-com:office:office" xmlns:oel="http://schemas.microsoft.com/office/2019/extlst" xmlns:r="http://schemas.openxmlformats.org/officeDocument/2006/relationships" xmlns:m="http://schemas.openxmlformats.org/officeDocument/2006/math" xmlns:v="urn:schemas-microsoft-com:vml" xmlns:wp14="http://schemas.microsoft.com/office/word/2010/wordprocessingDrawing" xmlns:wp="http://schemas.openxmlformats.org/drawingml/2006/wordprocessingDrawing" xmlns:w10="urn:schemas-microsoft-com:office:word" xmlns:w="http://schemas.openxmlformats.org/wordprocessingml/2006/main" xmlns:w14="http://schemas.microsoft.com/office/word/2010/wordml" xmlns:w15="http://schemas.microsoft.com/office/word/2012/wordml" xmlns:w16cex="http://schemas.microsoft.com/office/word/2018/wordml/cex" xmlns:w16cid="http://schemas.microsoft.com/office/word/2016/wordml/cid" xmlns:w16="http://schemas.microsoft.com/office/word/2018/wordml" xmlns:w16du="http://schemas.microsoft.com/office/word/2023/wordml/word16du" xmlns:w16sdtdh="http://schemas.microsoft.com/office/word/2020/wordml/sdtdatahash" xmlns:w16sdtfl="http://schemas.microsoft.com/office/word/2024/wordml/sdtformatlock" xmlns:w16se="http://schemas.microsoft.com/office/word/2015/wordml/symex" xmlns:wpg="http://schemas.microsoft.com/office/word/2010/wordprocessingGroup" xmlns:wpi="http://schemas.microsoft.com/office/word/2010/wordprocessingInk" xmlns:wne="http://schemas.microsoft.com/office/word/2006/wordml" xmlns:wps="http://schemas.microsoft.com/office/word/2010/wordprocessingShape" mc:Ignorable="w14 w15 w16se w16cid w16 w16cex w16sdtdh w16sdtfl w16du wp14">
   <w:sdt>
     <w:sdtPr>
       <w:id w:val="1333800111"/>
@@ -2151,7 +2449,7 @@
 </file>
 
 <file path=word/footnotes.xml><?xml version="1.0" encoding="utf-8"?>
-<w:footnotes xmlns:wpc="http://schemas.microsoft.com/office/word/2010/wordprocessingCanvas" xmlns:cx="http://schemas.microsoft.com/office/drawing/2014/chartex" xmlns:cx1="http://schemas.microsoft.com/office/drawing/2015/9/8/chartex" xmlns:cx2="http://schemas.microsoft.com/office/drawing/2015/10/21/chartex" xmlns:cx3="http://schemas.microsoft.com/office/drawing/2016/5/9/chartex" xmlns:cx4="http://schemas.microsoft.com/office/drawing/2016/5/10/chartex" xmlns:cx5="http://schemas.microsoft.com/office/drawing/2016/5/11/chartex" xmlns:cx6="http://schemas.microsoft.com/office/drawing/2016/5/12/chartex" xmlns:cx7="http://schemas.microsoft.com/office/drawing/2016/5/13/chartex" xmlns:cx8="http://schemas.microsoft.com/office/drawing/2016/5/14/chartex" xmlns:mc="http://schemas.openxmlformats.org/markup-compatibility/2006" xmlns:aink="http://schemas.microsoft.com/office/drawing/2016/ink" xmlns:am3d="http://schemas.microsoft.com/office/drawing/2017/model3d" xmlns:o="urn:schemas-microsoft-com:office:office" xmlns:oel="http://schemas.microsoft.com/office/2019/extlst" xmlns:r="http://schemas.openxmlformats.org/officeDocument/2006/relationships" xmlns:m="http://schemas.openxmlformats.org/officeDocument/2006/math" xmlns:v="urn:schemas-microsoft-com:vml" xmlns:wp14="http://schemas.microsoft.com/office/word/2010/wordprocessingDrawing" xmlns:wp="http://schemas.openxmlformats.org/drawingml/2006/wordprocessingDrawing" xmlns:w10="urn:schemas-microsoft-com:office:word" xmlns:w="http://schemas.openxmlformats.org/wordprocessingml/2006/main" xmlns:w14="http://schemas.microsoft.com/office/word/2010/wordml" xmlns:w15="http://schemas.microsoft.com/office/word/2012/wordml" xmlns:w16cei="http://schemas.microsoft.com/office/word/2026/wordml/cei" xmlns:w16cex="http://schemas.microsoft.com/office/word/2018/wordml/cex" xmlns:w16cid="http://schemas.microsoft.com/office/word/2016/wordml/cid" xmlns:w16="http://schemas.microsoft.com/office/word/2018/wordml" xmlns:w16du="http://schemas.microsoft.com/office/word/2023/wordml/word16du" xmlns:w16sdtdh="http://schemas.microsoft.com/office/word/2020/wordml/sdtdatahash" xmlns:w16sdtfl="http://schemas.microsoft.com/office/word/2024/wordml/sdtformatlock" xmlns:w16se="http://schemas.microsoft.com/office/word/2015/wordml/symex" xmlns:wpg="http://schemas.microsoft.com/office/word/2010/wordprocessingGroup" xmlns:wpi="http://schemas.microsoft.com/office/word/2010/wordprocessingInk" xmlns:wne="http://schemas.microsoft.com/office/word/2006/wordml" xmlns:wps="http://schemas.microsoft.com/office/word/2010/wordprocessingShape" mc:Ignorable="w14 w15 w16se w16cid w16 w16cex w16sdtdh w16sdtfl w16du wp14">
+<w:footnotes xmlns:wpc="http://schemas.microsoft.com/office/word/2010/wordprocessingCanvas" xmlns:cx="http://schemas.microsoft.com/office/drawing/2014/chartex" xmlns:cx1="http://schemas.microsoft.com/office/drawing/2015/9/8/chartex" xmlns:cx2="http://schemas.microsoft.com/office/drawing/2015/10/21/chartex" xmlns:cx3="http://schemas.microsoft.com/office/drawing/2016/5/9/chartex" xmlns:cx4="http://schemas.microsoft.com/office/drawing/2016/5/10/chartex" xmlns:cx5="http://schemas.microsoft.com/office/drawing/2016/5/11/chartex" xmlns:cx6="http://schemas.microsoft.com/office/drawing/2016/5/12/chartex" xmlns:cx7="http://schemas.microsoft.com/office/drawing/2016/5/13/chartex" xmlns:cx8="http://schemas.microsoft.com/office/drawing/2016/5/14/chartex" xmlns:mc="http://schemas.openxmlformats.org/markup-compatibility/2006" xmlns:aink="http://schemas.microsoft.com/office/drawing/2016/ink" xmlns:am3d="http://schemas.microsoft.com/office/drawing/2017/model3d" xmlns:o="urn:schemas-microsoft-com:office:office" xmlns:oel="http://schemas.microsoft.com/office/2019/extlst" xmlns:r="http://schemas.openxmlformats.org/officeDocument/2006/relationships" xmlns:m="http://schemas.openxmlformats.org/officeDocument/2006/math" xmlns:v="urn:schemas-microsoft-com:vml" xmlns:wp14="http://schemas.microsoft.com/office/word/2010/wordprocessingDrawing" xmlns:wp="http://schemas.openxmlformats.org/drawingml/2006/wordprocessingDrawing" xmlns:w10="urn:schemas-microsoft-com:office:word" xmlns:w="http://schemas.openxmlformats.org/wordprocessingml/2006/main" xmlns:w14="http://schemas.microsoft.com/office/word/2010/wordml" xmlns:w15="http://schemas.microsoft.com/office/word/2012/wordml" xmlns:w16cex="http://schemas.microsoft.com/office/word/2018/wordml/cex" xmlns:w16cid="http://schemas.microsoft.com/office/word/2016/wordml/cid" xmlns:w16="http://schemas.microsoft.com/office/word/2018/wordml" xmlns:w16du="http://schemas.microsoft.com/office/word/2023/wordml/word16du" xmlns:w16sdtdh="http://schemas.microsoft.com/office/word/2020/wordml/sdtdatahash" xmlns:w16sdtfl="http://schemas.microsoft.com/office/word/2024/wordml/sdtformatlock" xmlns:w16se="http://schemas.microsoft.com/office/word/2015/wordml/symex" xmlns:wpg="http://schemas.microsoft.com/office/word/2010/wordprocessingGroup" xmlns:wpi="http://schemas.microsoft.com/office/word/2010/wordprocessingInk" xmlns:wne="http://schemas.microsoft.com/office/word/2006/wordml" xmlns:wps="http://schemas.microsoft.com/office/word/2010/wordprocessingShape" mc:Ignorable="w14 w15 w16se w16cid w16 w16cex w16sdtdh w16sdtfl w16du wp14">
   <w:footnote w:type="separator" w:id="-1">
     <w:p>
       <w:pPr>
@@ -2176,7 +2474,7 @@
 </file>
 
 <file path=word/header1.xml><?xml version="1.0" encoding="utf-8"?>
-<w:hdr xmlns:wpc="http://schemas.microsoft.com/office/word/2010/wordprocessingCanvas" xmlns:cx="http://schemas.microsoft.com/office/drawing/2014/chartex" xmlns:cx1="http://schemas.microsoft.com/office/drawing/2015/9/8/chartex" xmlns:cx2="http://schemas.microsoft.com/office/drawing/2015/10/21/chartex" xmlns:cx3="http://schemas.microsoft.com/office/drawing/2016/5/9/chartex" xmlns:cx4="http://schemas.microsoft.com/office/drawing/2016/5/10/chartex" xmlns:cx5="http://schemas.microsoft.com/office/drawing/2016/5/11/chartex" xmlns:cx6="http://schemas.microsoft.com/office/drawing/2016/5/12/chartex" xmlns:cx7="http://schemas.microsoft.com/office/drawing/2016/5/13/chartex" xmlns:cx8="http://schemas.microsoft.com/office/drawing/2016/5/14/chartex" xmlns:mc="http://schemas.openxmlformats.org/markup-compatibility/2006" xmlns:aink="http://schemas.microsoft.com/office/drawing/2016/ink" xmlns:am3d="http://schemas.microsoft.com/office/drawing/2017/model3d" xmlns:o="urn:schemas-microsoft-com:office:office" xmlns:oel="http://schemas.microsoft.com/office/2019/extlst" xmlns:r="http://schemas.openxmlformats.org/officeDocument/2006/relationships" xmlns:m="http://schemas.openxmlformats.org/officeDocument/2006/math" xmlns:v="urn:schemas-microsoft-com:vml" xmlns:wp14="http://schemas.microsoft.com/office/word/2010/wordprocessingDrawing" xmlns:wp="http://schemas.openxmlformats.org/drawingml/2006/wordprocessingDrawing" xmlns:w10="urn:schemas-microsoft-com:office:word" xmlns:w="http://schemas.openxmlformats.org/wordprocessingml/2006/main" xmlns:w14="http://schemas.microsoft.com/office/word/2010/wordml" xmlns:w15="http://schemas.microsoft.com/office/word/2012/wordml" xmlns:w16cei="http://schemas.microsoft.com/office/word/2026/wordml/cei" xmlns:w16cex="http://schemas.microsoft.com/office/word/2018/wordml/cex" xmlns:w16cid="http://schemas.microsoft.com/office/word/2016/wordml/cid" xmlns:w16="http://schemas.microsoft.com/office/word/2018/wordml" xmlns:w16du="http://schemas.microsoft.com/office/word/2023/wordml/word16du" xmlns:w16sdtdh="http://schemas.microsoft.com/office/word/2020/wordml/sdtdatahash" xmlns:w16sdtfl="http://schemas.microsoft.com/office/word/2024/wordml/sdtformatlock" xmlns:w16se="http://schemas.microsoft.com/office/word/2015/wordml/symex" xmlns:wpg="http://schemas.microsoft.com/office/word/2010/wordprocessingGroup" xmlns:wpi="http://schemas.microsoft.com/office/word/2010/wordprocessingInk" xmlns:wne="http://schemas.microsoft.com/office/word/2006/wordml" xmlns:wps="http://schemas.microsoft.com/office/word/2010/wordprocessingShape" mc:Ignorable="w14 w15 w16se w16cid w16 w16cex w16sdtdh w16sdtfl w16du wp14">
+<w:hdr xmlns:wpc="http://schemas.microsoft.com/office/word/2010/wordprocessingCanvas" xmlns:cx="http://schemas.microsoft.com/office/drawing/2014/chartex" xmlns:cx1="http://schemas.microsoft.com/office/drawing/2015/9/8/chartex" xmlns:cx2="http://schemas.microsoft.com/office/drawing/2015/10/21/chartex" xmlns:cx3="http://schemas.microsoft.com/office/drawing/2016/5/9/chartex" xmlns:cx4="http://schemas.microsoft.com/office/drawing/2016/5/10/chartex" xmlns:cx5="http://schemas.microsoft.com/office/drawing/2016/5/11/chartex" xmlns:cx6="http://schemas.microsoft.com/office/drawing/2016/5/12/chartex" xmlns:cx7="http://schemas.microsoft.com/office/drawing/2016/5/13/chartex" xmlns:cx8="http://schemas.microsoft.com/office/drawing/2016/5/14/chartex" xmlns:mc="http://schemas.openxmlformats.org/markup-compatibility/2006" xmlns:aink="http://schemas.microsoft.com/office/drawing/2016/ink" xmlns:am3d="http://schemas.microsoft.com/office/drawing/2017/model3d" xmlns:o="urn:schemas-microsoft-com:office:office" xmlns:oel="http://schemas.microsoft.com/office/2019/extlst" xmlns:r="http://schemas.openxmlformats.org/officeDocument/2006/relationships" xmlns:m="http://schemas.openxmlformats.org/officeDocument/2006/math" xmlns:v="urn:schemas-microsoft-com:vml" xmlns:wp14="http://schemas.microsoft.com/office/word/2010/wordprocessingDrawing" xmlns:wp="http://schemas.openxmlformats.org/drawingml/2006/wordprocessingDrawing" xmlns:w10="urn:schemas-microsoft-com:office:word" xmlns:w="http://schemas.openxmlformats.org/wordprocessingml/2006/main" xmlns:w14="http://schemas.microsoft.com/office/word/2010/wordml" xmlns:w15="http://schemas.microsoft.com/office/word/2012/wordml" xmlns:w16cex="http://schemas.microsoft.com/office/word/2018/wordml/cex" xmlns:w16cid="http://schemas.microsoft.com/office/word/2016/wordml/cid" xmlns:w16="http://schemas.microsoft.com/office/word/2018/wordml" xmlns:w16du="http://schemas.microsoft.com/office/word/2023/wordml/word16du" xmlns:w16sdtdh="http://schemas.microsoft.com/office/word/2020/wordml/sdtdatahash" xmlns:w16sdtfl="http://schemas.microsoft.com/office/word/2024/wordml/sdtformatlock" xmlns:w16se="http://schemas.microsoft.com/office/word/2015/wordml/symex" xmlns:wpg="http://schemas.microsoft.com/office/word/2010/wordprocessingGroup" xmlns:wpi="http://schemas.microsoft.com/office/word/2010/wordprocessingInk" xmlns:wne="http://schemas.microsoft.com/office/word/2006/wordml" xmlns:wps="http://schemas.microsoft.com/office/word/2010/wordprocessingShape" mc:Ignorable="w14 w15 w16se w16cid w16 w16cex w16sdtdh w16sdtfl w16du wp14">
   <w:p>
     <w:pPr>
       <w:pStyle w:val="Header"/>
@@ -2198,7 +2496,7 @@
 </file>
 
 <file path=word/numbering.xml><?xml version="1.0" encoding="utf-8"?>
-<w:numbering xmlns:wpc="http://schemas.microsoft.com/office/word/2010/wordprocessingCanvas" xmlns:cx="http://schemas.microsoft.com/office/drawing/2014/chartex" xmlns:cx1="http://schemas.microsoft.com/office/drawing/2015/9/8/chartex" xmlns:cx2="http://schemas.microsoft.com/office/drawing/2015/10/21/chartex" xmlns:cx3="http://schemas.microsoft.com/office/drawing/2016/5/9/chartex" xmlns:cx4="http://schemas.microsoft.com/office/drawing/2016/5/10/chartex" xmlns:cx5="http://schemas.microsoft.com/office/drawing/2016/5/11/chartex" xmlns:cx6="http://schemas.microsoft.com/office/drawing/2016/5/12/chartex" xmlns:cx7="http://schemas.microsoft.com/office/drawing/2016/5/13/chartex" xmlns:cx8="http://schemas.microsoft.com/office/drawing/2016/5/14/chartex" xmlns:mc="http://schemas.openxmlformats.org/markup-compatibility/2006" xmlns:aink="http://schemas.microsoft.com/office/drawing/2016/ink" xmlns:am3d="http://schemas.microsoft.com/office/drawing/2017/model3d" xmlns:o="urn:schemas-microsoft-com:office:office" xmlns:oel="http://schemas.microsoft.com/office/2019/extlst" xmlns:r="http://schemas.openxmlformats.org/officeDocument/2006/relationships" xmlns:m="http://schemas.openxmlformats.org/officeDocument/2006/math" xmlns:v="urn:schemas-microsoft-com:vml" xmlns:wp14="http://schemas.microsoft.com/office/word/2010/wordprocessingDrawing" xmlns:wp="http://schemas.openxmlformats.org/drawingml/2006/wordprocessingDrawing" xmlns:w10="urn:schemas-microsoft-com:office:word" xmlns:w="http://schemas.openxmlformats.org/wordprocessingml/2006/main" xmlns:w14="http://schemas.microsoft.com/office/word/2010/wordml" xmlns:w15="http://schemas.microsoft.com/office/word/2012/wordml" xmlns:w16cei="http://schemas.microsoft.com/office/word/2026/wordml/cei" xmlns:w16cex="http://schemas.microsoft.com/office/word/2018/wordml/cex" xmlns:w16cid="http://schemas.microsoft.com/office/word/2016/wordml/cid" xmlns:w16="http://schemas.microsoft.com/office/word/2018/wordml" xmlns:w16du="http://schemas.microsoft.com/office/word/2023/wordml/word16du" xmlns:w16sdtdh="http://schemas.microsoft.com/office/word/2020/wordml/sdtdatahash" xmlns:w16sdtfl="http://schemas.microsoft.com/office/word/2024/wordml/sdtformatlock" xmlns:w16se="http://schemas.microsoft.com/office/word/2015/wordml/symex" xmlns:wpg="http://schemas.microsoft.com/office/word/2010/wordprocessingGroup" xmlns:wpi="http://schemas.microsoft.com/office/word/2010/wordprocessingInk" xmlns:wne="http://schemas.microsoft.com/office/word/2006/wordml" xmlns:wps="http://schemas.microsoft.com/office/word/2010/wordprocessingShape" mc:Ignorable="w14 w15 w16se w16cid w16 w16cex w16sdtdh w16sdtfl w16du wp14">
+<w:numbering xmlns:wpc="http://schemas.microsoft.com/office/word/2010/wordprocessingCanvas" xmlns:cx="http://schemas.microsoft.com/office/drawing/2014/chartex" xmlns:cx1="http://schemas.microsoft.com/office/drawing/2015/9/8/chartex" xmlns:cx2="http://schemas.microsoft.com/office/drawing/2015/10/21/chartex" xmlns:cx3="http://schemas.microsoft.com/office/drawing/2016/5/9/chartex" xmlns:cx4="http://schemas.microsoft.com/office/drawing/2016/5/10/chartex" xmlns:cx5="http://schemas.microsoft.com/office/drawing/2016/5/11/chartex" xmlns:cx6="http://schemas.microsoft.com/office/drawing/2016/5/12/chartex" xmlns:cx7="http://schemas.microsoft.com/office/drawing/2016/5/13/chartex" xmlns:cx8="http://schemas.microsoft.com/office/drawing/2016/5/14/chartex" xmlns:mc="http://schemas.openxmlformats.org/markup-compatibility/2006" xmlns:aink="http://schemas.microsoft.com/office/drawing/2016/ink" xmlns:am3d="http://schemas.microsoft.com/office/drawing/2017/model3d" xmlns:o="urn:schemas-microsoft-com:office:office" xmlns:oel="http://schemas.microsoft.com/office/2019/extlst" xmlns:r="http://schemas.openxmlformats.org/officeDocument/2006/relationships" xmlns:m="http://schemas.openxmlformats.org/officeDocument/2006/math" xmlns:v="urn:schemas-microsoft-com:vml" xmlns:wp14="http://schemas.microsoft.com/office/word/2010/wordprocessingDrawing" xmlns:wp="http://schemas.openxmlformats.org/drawingml/2006/wordprocessingDrawing" xmlns:w10="urn:schemas-microsoft-com:office:word" xmlns:w="http://schemas.openxmlformats.org/wordprocessingml/2006/main" xmlns:w14="http://schemas.microsoft.com/office/word/2010/wordml" xmlns:w15="http://schemas.microsoft.com/office/word/2012/wordml" xmlns:w16cex="http://schemas.microsoft.com/office/word/2018/wordml/cex" xmlns:w16cid="http://schemas.microsoft.com/office/word/2016/wordml/cid" xmlns:w16="http://schemas.microsoft.com/office/word/2018/wordml" xmlns:w16du="http://schemas.microsoft.com/office/word/2023/wordml/word16du" xmlns:w16sdtdh="http://schemas.microsoft.com/office/word/2020/wordml/sdtdatahash" xmlns:w16sdtfl="http://schemas.microsoft.com/office/word/2024/wordml/sdtformatlock" xmlns:w16se="http://schemas.microsoft.com/office/word/2015/wordml/symex" xmlns:wpg="http://schemas.microsoft.com/office/word/2010/wordprocessingGroup" xmlns:wpi="http://schemas.microsoft.com/office/word/2010/wordprocessingInk" xmlns:wne="http://schemas.microsoft.com/office/word/2006/wordml" xmlns:wps="http://schemas.microsoft.com/office/word/2010/wordprocessingShape" mc:Ignorable="w14 w15 w16se w16cid w16 w16cex w16sdtdh w16sdtfl w16du wp14">
   <w:abstractNum w:abstractNumId="0" w15:restartNumberingAfterBreak="0">
     <w:nsid w:val="10D61C53"/>
     <w:multiLevelType w:val="hybridMultilevel"/>
@@ -2288,8 +2586,100 @@
       </w:pPr>
     </w:lvl>
   </w:abstractNum>
+  <w:abstractNum w:abstractNumId="1" w15:restartNumberingAfterBreak="0">
+    <w:nsid w:val="4F2F080C"/>
+    <w:multiLevelType w:val="hybridMultilevel"/>
+    <w:tmpl w:val="424476E8"/>
+    <w:lvl w:ilvl="0" w:tplc="4009000F">
+      <w:start w:val="1"/>
+      <w:numFmt w:val="decimal"/>
+      <w:lvlText w:val="%1."/>
+      <w:lvlJc w:val="left"/>
+      <w:pPr>
+        <w:ind w:left="720" w:hanging="360"/>
+      </w:pPr>
+      <w:rPr>
+        <w:rFonts w:hint="default"/>
+      </w:rPr>
+    </w:lvl>
+    <w:lvl w:ilvl="1" w:tplc="40090019" w:tentative="1">
+      <w:start w:val="1"/>
+      <w:numFmt w:val="lowerLetter"/>
+      <w:lvlText w:val="%2."/>
+      <w:lvlJc w:val="left"/>
+      <w:pPr>
+        <w:ind w:left="1440" w:hanging="360"/>
+      </w:pPr>
+    </w:lvl>
+    <w:lvl w:ilvl="2" w:tplc="4009001B" w:tentative="1">
+      <w:start w:val="1"/>
+      <w:numFmt w:val="lowerRoman"/>
+      <w:lvlText w:val="%3."/>
+      <w:lvlJc w:val="right"/>
+      <w:pPr>
+        <w:ind w:left="2160" w:hanging="180"/>
+      </w:pPr>
+    </w:lvl>
+    <w:lvl w:ilvl="3" w:tplc="4009000F" w:tentative="1">
+      <w:start w:val="1"/>
+      <w:numFmt w:val="decimal"/>
+      <w:lvlText w:val="%4."/>
+      <w:lvlJc w:val="left"/>
+      <w:pPr>
+        <w:ind w:left="2880" w:hanging="360"/>
+      </w:pPr>
+    </w:lvl>
+    <w:lvl w:ilvl="4" w:tplc="40090019" w:tentative="1">
+      <w:start w:val="1"/>
+      <w:numFmt w:val="lowerLetter"/>
+      <w:lvlText w:val="%5."/>
+      <w:lvlJc w:val="left"/>
+      <w:pPr>
+        <w:ind w:left="3600" w:hanging="360"/>
+      </w:pPr>
+    </w:lvl>
+    <w:lvl w:ilvl="5" w:tplc="4009001B" w:tentative="1">
+      <w:start w:val="1"/>
+      <w:numFmt w:val="lowerRoman"/>
+      <w:lvlText w:val="%6."/>
+      <w:lvlJc w:val="right"/>
+      <w:pPr>
+        <w:ind w:left="4320" w:hanging="180"/>
+      </w:pPr>
+    </w:lvl>
+    <w:lvl w:ilvl="6" w:tplc="4009000F" w:tentative="1">
+      <w:start w:val="1"/>
+      <w:numFmt w:val="decimal"/>
+      <w:lvlText w:val="%7."/>
+      <w:lvlJc w:val="left"/>
+      <w:pPr>
+        <w:ind w:left="5040" w:hanging="360"/>
+      </w:pPr>
+    </w:lvl>
+    <w:lvl w:ilvl="7" w:tplc="40090019" w:tentative="1">
+      <w:start w:val="1"/>
+      <w:numFmt w:val="lowerLetter"/>
+      <w:lvlText w:val="%8."/>
+      <w:lvlJc w:val="left"/>
+      <w:pPr>
+        <w:ind w:left="5760" w:hanging="360"/>
+      </w:pPr>
+    </w:lvl>
+    <w:lvl w:ilvl="8" w:tplc="4009001B" w:tentative="1">
+      <w:start w:val="1"/>
+      <w:numFmt w:val="lowerRoman"/>
+      <w:lvlText w:val="%9."/>
+      <w:lvlJc w:val="right"/>
+      <w:pPr>
+        <w:ind w:left="6480" w:hanging="180"/>
+      </w:pPr>
+    </w:lvl>
+  </w:abstractNum>
   <w:num w:numId="1" w16cid:durableId="1073965714">
     <w:abstractNumId w:val="0"/>
+  </w:num>
+  <w:num w:numId="2" w16cid:durableId="1238975906">
+    <w:abstractNumId w:val="1"/>
   </w:num>
 </w:numbering>
 </file>
@@ -3254,6 +3644,20 @@
     <w:uiPriority w:val="99"/>
     <w:rsid w:val="00D03A51"/>
   </w:style>
+  <w:style w:type="paragraph" w:customStyle="1" w:styleId="msonormal0">
+    <w:name w:val="msonormal"/>
+    <w:basedOn w:val="Normal"/>
+    <w:rsid w:val="005C6007"/>
+    <w:pPr>
+      <w:spacing w:before="100" w:beforeAutospacing="1" w:after="100" w:afterAutospacing="1" w:line="240" w:lineRule="auto"/>
+    </w:pPr>
+    <w:rPr>
+      <w:rFonts w:ascii="Times New Roman" w:eastAsia="Times New Roman" w:hAnsi="Times New Roman" w:cs="Times New Roman"/>
+      <w:kern w:val="0"/>
+      <w:lang w:eastAsia="en-IN"/>
+      <w14:ligatures w14:val="none"/>
+    </w:rPr>
+  </w:style>
 </w:styles>
 </file>
 

</xml_diff>